<commit_message>
completed media tracker app layout
</commit_message>
<xml_diff>
--- a/Mathew Caldwell Media Tracker Part 1.docx
+++ b/Mathew Caldwell Media Tracker Part 1.docx
@@ -71,35 +71,25 @@
         <w:rPr>
           <w:lang w:val="en-US"/>
         </w:rPr>
-        <w:t xml:space="preserve">These days there is too much media to keep a comprehensive list of ones you want to watch in ones head. </w:t>
-      </w:r>
-      <w:proofErr w:type="spellStart"/>
-      <w:r>
-        <w:rPr>
-          <w:lang w:val="en-US"/>
-        </w:rPr>
-        <w:t>WhatsOn</w:t>
-      </w:r>
-      <w:proofErr w:type="spellEnd"/>
-      <w:r>
-        <w:rPr>
-          <w:lang w:val="en-US"/>
-        </w:rPr>
-        <w:t xml:space="preserve"> allows you to add and keeps track of different types of media (books, tv series, movies). You will be able to log the relevant data along with the media including release dates, streaming service it is on (if applicable) and </w:t>
-      </w:r>
-      <w:proofErr w:type="spellStart"/>
-      <w:r>
-        <w:rPr>
-          <w:lang w:val="en-US"/>
-        </w:rPr>
-        <w:t>WhatsOn</w:t>
-      </w:r>
-      <w:proofErr w:type="spellEnd"/>
-      <w:r>
-        <w:rPr>
-          <w:lang w:val="en-US"/>
-        </w:rPr>
-        <w:t xml:space="preserve"> will keep track of what is being released when and where to view it. Users will also be able to remove items when they have finished with it.</w:t>
+        <w:t xml:space="preserve">These days there is too much media to keep a comprehensive list of ones you want to watch in </w:t>
+      </w:r>
+      <w:r>
+        <w:rPr>
+          <w:lang w:val="en-US"/>
+        </w:rPr>
+        <w:t>one’s</w:t>
+      </w:r>
+      <w:r>
+        <w:rPr>
+          <w:lang w:val="en-US"/>
+        </w:rPr>
+        <w:t xml:space="preserve"> head. WhatsOn</w:t>
+      </w:r>
+      <w:r>
+        <w:rPr>
+          <w:lang w:val="en-US"/>
+        </w:rPr>
+        <w:t xml:space="preserve"> allows you to add and keeps track of different types of media (books, tv series, movies). You will be able to log the relevant data along with the media including release dates, streaming service it is on (if applicable) and WhatsOn will keep track of what is being released when and where to view it. Users will also be able to remove items when they have finished with it.</w:t>
       </w:r>
     </w:p>
     <w:p>
@@ -128,19 +118,11 @@
           <w:lang w:val="en-US"/>
         </w:rPr>
       </w:pPr>
-      <w:proofErr w:type="spellStart"/>
-      <w:r>
-        <w:rPr>
-          <w:lang w:val="en-US"/>
-        </w:rPr>
-        <w:t>WhatsOn</w:t>
-      </w:r>
-      <w:proofErr w:type="spellEnd"/>
-      <w:r>
-        <w:rPr>
-          <w:lang w:val="en-US"/>
-        </w:rPr>
-        <w:t xml:space="preserve"> is a media tracking app focused on keeping a cohesive list of media the user wants to consume.</w:t>
+      <w:r>
+        <w:rPr>
+          <w:lang w:val="en-US"/>
+        </w:rPr>
+        <w:t>WhatsOn is a media tracking app focused on keeping a cohesive list of media the user wants to consume.</w:t>
       </w:r>
       <w:r>
         <w:rPr>
@@ -505,6 +487,72 @@
     </w:p>
     <w:p>
       <w:pPr>
+        <w:pStyle w:val="ListParagraph"/>
+        <w:numPr>
+          <w:ilvl w:val="0"/>
+          <w:numId w:val="1"/>
+        </w:numPr>
+        <w:rPr>
+          <w:lang w:val="en-US"/>
+        </w:rPr>
+      </w:pPr>
+      <w:r>
+        <w:rPr>
+          <w:lang w:val="en-US"/>
+        </w:rPr>
+        <w:t xml:space="preserve">Varying display outline based on type of media (book: </w:t>
+      </w:r>
+      <w:r>
+        <w:rPr>
+          <w:lang w:val="en-US"/>
+        </w:rPr>
+        <w:t>purple</w:t>
+      </w:r>
+      <w:r>
+        <w:rPr>
+          <w:lang w:val="en-US"/>
+        </w:rPr>
+        <w:t>, movie: green, series: blue)</w:t>
+      </w:r>
+    </w:p>
+    <w:p>
+      <w:pPr>
+        <w:pStyle w:val="ListParagraph"/>
+        <w:numPr>
+          <w:ilvl w:val="0"/>
+          <w:numId w:val="1"/>
+        </w:numPr>
+        <w:rPr>
+          <w:lang w:val="en-US"/>
+        </w:rPr>
+      </w:pPr>
+      <w:r>
+        <w:rPr>
+          <w:lang w:val="en-US"/>
+        </w:rPr>
+        <w:t>Swipe gestures to navigate through the tabs</w:t>
+      </w:r>
+    </w:p>
+    <w:p>
+      <w:pPr>
+        <w:pStyle w:val="ListParagraph"/>
+        <w:numPr>
+          <w:ilvl w:val="0"/>
+          <w:numId w:val="1"/>
+        </w:numPr>
+        <w:rPr>
+          <w:lang w:val="en-US"/>
+        </w:rPr>
+      </w:pPr>
+      <w:r>
+        <w:rPr>
+          <w:lang w:val="en-US"/>
+        </w:rPr>
+        <w:t>Double tap item to mark it as finished or if finished to unfinish it</w:t>
+      </w:r>
+    </w:p>
+    <w:p>
+      <w:pPr>
         <w:rPr>
           <w:lang w:val="en-US"/>
         </w:rPr>
@@ -539,21 +587,19 @@
         <w:rPr>
           <w:lang w:val="en-US"/>
         </w:rPr>
-        <w:t xml:space="preserve"> </w:t>
-      </w:r>
-      <w:proofErr w:type="spellStart"/>
-      <w:r>
-        <w:rPr>
-          <w:lang w:val="en-US"/>
-        </w:rPr>
-        <w:t>WhatsOn</w:t>
-      </w:r>
-      <w:proofErr w:type="spellEnd"/>
-      <w:r>
-        <w:rPr>
-          <w:lang w:val="en-US"/>
-        </w:rPr>
-        <w:t xml:space="preserve"> will be free to use but there will be banner add (least invasive type) and users can only do x media logs per x time frame. Premium subscription will remove adds and allow for unlimited logs. For first time users will be given the option to have a one month free trial of premium for free.</w:t>
+        <w:t xml:space="preserve"> WhatsOn will be free to use but there will be banner add (least invasive type) and users can only do x media logs per x time frame. Premium subscription will remove adds and allow for unlimited logs. For first time users will be given the option to have a </w:t>
+      </w:r>
+      <w:r>
+        <w:rPr>
+          <w:lang w:val="en-US"/>
+        </w:rPr>
+        <w:t>one-month</w:t>
+      </w:r>
+      <w:r>
+        <w:rPr>
+          <w:lang w:val="en-US"/>
+        </w:rPr>
+        <w:t xml:space="preserve"> free trial of premium for free.</w:t>
       </w:r>
     </w:p>
     <w:sectPr>

</xml_diff>